<commit_message>
feat: prepare TATSUKI paper for SSR/SSH Open/JCSS submission
Major changes:
- Convert citations from APA author-date to numbered [1] style (Vancouver)
- Add Data Availability Statement section
- Strengthen computational social science positioning
- Reduce keywords to 6 (including 'computational social science', 'agent-based model')
- Create cover letters for SSR, SSH Open, and JCSS
- Update highlights (3-5 items, max 85 chars each per SSR requirement)
- Update title page and declarations for multi-journal submission
- Regenerate all docx/pptx output files

Submission strategy: SSR → SSH Open → JCSS cascade
- SSR/SSH Open: Elsevier transfer (double-blind, numbered citations)
- JCSS: Independent Springer submission (single-blind, numbered citations)

All 30 references cited in text, no orphan references.
TATSUKI acronym consistency verified across all files.

Co-Authored-By: Tatsuki Onishi <bougtoir@gmail.com>
</commit_message>
<xml_diff>
--- a/tasuki-electoral-model/output/submission/Highlights.docx
+++ b/tasuki-electoral-model/output/submission/Highlights.docx
@@ -20,7 +20,7 @@
         <w:spacing w:after="120"/>
       </w:pPr>
       <w:r>
-        <w:t>TATSUKI links candidate trust coefficients to measured pledge fulfillment.</w:t>
+        <w:t>TATSUKI links candidate trust to measured pledge fulfillment scores.</w:t>
       </w:r>
     </w:p>
     <w:p>
@@ -29,7 +29,7 @@
         <w:spacing w:after="120"/>
       </w:pPr>
       <w:r>
-        <w:t>Agent-based model shows TATSUKI raises accountability and resists gaming.</w:t>
+        <w:t>Agent-based model shows TATSUKI raises accountability, resists gaming.</w:t>
       </w:r>
     </w:p>
     <w:p>
@@ -47,7 +47,7 @@
         <w:spacing w:after="120"/>
       </w:pPr>
       <w:r>
-        <w:t>Model calibrated with 1,050 real pledges from Polimeter and Thomson data.</w:t>
+        <w:t>Model calibrated with 1,050 real pledges from Polimeter project data.</w:t>
       </w:r>
     </w:p>
     <w:p>
@@ -56,7 +56,7 @@
         <w:spacing w:after="120"/>
       </w:pPr>
       <w:r>
-        <w:t>Counterfactual analysis confirms stable trust trajectories for Trudeau.</w:t>
+        <w:t>Counterfactual analysis confirms stable trust trajectories empirically.</w:t>
       </w:r>
     </w:p>
     <w:p/>
@@ -71,7 +71,7 @@
         <w:rPr>
           <w:i/>
         </w:rPr>
-        <w:t>Each highlight must be no more than 85 characters including spaces. These are entered separately during the Editorial Manager submission process.</w:t>
+        <w:t>Each highlight must be no more than 85 characters including spaces. Entered separately during the Editorial Manager submission process.</w:t>
       </w:r>
     </w:p>
     <w:sectPr>

</xml_diff>